<commit_message>
Offer bar only where something can be bought; sale-date line; host samples; paid lines in downloads; home lead
</commit_message>
<xml_diff>
--- a/downloads/hosts-airbnb-check-in-instructions-message.docx
+++ b/downloads/hosts-airbnb-check-in-instructions-message.docx
@@ -802,6 +802,42 @@
           <w:sz w:val="18"/>
         </w:rPr>
         <w:t xml:space="preserve">More free pages: https://proskillpacks.github.io/hosts/</w:t>
+      </w:r>
+    </w:p>
+    <w:p>
+      <w:pPr>
+        <w:spacing w:after="120"/>
+      </w:pPr>
+      <w:r>
+        <w:rPr>
+          <w:color w:val="666666"/>
+          <w:sz w:val="18"/>
+        </w:rPr>
+        <w:t xml:space="preserve">The full version: Host Ops Pack. Six skills for the listing, review and house-rules jobs of hosts who run their own listings.</w:t>
+      </w:r>
+    </w:p>
+    <w:p>
+      <w:pPr>
+        <w:spacing w:after="120"/>
+      </w:pPr>
+      <w:r>
+        <w:rPr>
+          <w:color w:val="666666"/>
+          <w:sz w:val="18"/>
+        </w:rPr>
+        <w:t xml:space="preserve">$29, one price. Half price for the first 10 buyers with code FIRST10. 30-day refund.</w:t>
+      </w:r>
+    </w:p>
+    <w:p>
+      <w:pPr>
+        <w:spacing w:after="120"/>
+      </w:pPr>
+      <w:r>
+        <w:rPr>
+          <w:color w:val="666666"/>
+          <w:sz w:val="18"/>
+        </w:rPr>
+        <w:t xml:space="preserve">More about it: https://proskillpacks.github.io/packs/host-ops-pack/</w:t>
       </w:r>
     </w:p>
     <w:sectPr>

</xml_diff>